<commit_message>
Promote new UIUX spec to v1.2.1 canonical, UI system to v1.1.1 with locked typography, archive superseded Figma spec
</commit_message>
<xml_diff>
--- a/ROE UI DESIGN SYSTEM.docx
+++ b/ROE UI DESIGN SYSTEM.docx
@@ -46,7 +46,9 @@
         <w:br/>
         <w:t>Subtitle: No One Lost to Silence</w:t>
         <w:br/>
-        <w:t>Design System Version: 1.1</w:t>
+        <w:t>Design System Version: 1.1.1</w:t>
+        <w:br/>
+        <w:t>Changelog v1.1→v1.1.1 (9 Oct 2026): locked typography to Jakarta display + Inter body + mono metadata to match Figma v1.2.1 §12.2; Manrope retired to fallback.</w:t>
         <w:br/>
         <w:t>Changelog v1.0→v1.1 (9 Oct 2026): canonical 10-step journey (fixes §20), P01–P20 vs F01–F18 naming, Paused server rules, notifications MVP subset, search default scope, member own-only lock, FUTURE tags for care/celebrations/AI, aligned to PRD/TRD v1.1.</w:t>
         <w:br/>
@@ -4776,15 +4778,7 @@
         </w:rPr>
       </w:pPr>
       <w:r>
-        <w:rPr>
-          <w:rFonts w:ascii="Times New Roman" w:eastAsia="Times New Roman" w:hAnsi="Times New Roman" w:cs="Times New Roman"/>
-          <w:b/>
-          <w:bCs/>
-          <w:kern w:val="0"/>
-          <w:lang w:eastAsia="en-GB"/>
-          <w14:ligatures w14:val="none"/>
-        </w:rPr>
-        <w:t>Inter</w:t>
+        <w:t>Inter — LOCKED body/UI (navigation, buttons, forms, lists, tables)</w:t>
       </w:r>
     </w:p>
     <w:p>
@@ -4818,15 +4812,7 @@
         </w:rPr>
       </w:pPr>
       <w:r>
-        <w:rPr>
-          <w:rFonts w:ascii="Times New Roman" w:eastAsia="Times New Roman" w:hAnsi="Times New Roman" w:cs="Times New Roman"/>
-          <w:b/>
-          <w:bCs/>
-          <w:kern w:val="0"/>
-          <w:lang w:eastAsia="en-GB"/>
-          <w14:ligatures w14:val="none"/>
-        </w:rPr>
-        <w:t>Manrope</w:t>
+        <w:t>Manrope — retired to fallback only (do not use for new screens)</w:t>
       </w:r>
     </w:p>
     <w:p>
@@ -26788,6 +26774,63 @@
         <w:t>ROE — No one lost to silence.</w:t>
       </w:r>
     </w:p>
+    <w:p>
+      <w:pPr>
+        <w:pStyle w:val="Heading1"/>
+      </w:pPr>
+      <w:r>
+        <w:t>61. Typography Lock v1.1.1 (matches Figma v1.2.1)</w:t>
+      </w:r>
+    </w:p>
+    <w:p>
+      <w:r>
+        <w:rPr>
+          <w:b/>
+        </w:rPr>
+        <w:t xml:space="preserve">Display (warm/human): </w:t>
+      </w:r>
+      <w:r>
+        <w:t>Plus Jakarta Sans 500/600/700 — page titles 24px/600, person names 18–20px/600, card headings 16–18px/600, greeting header, empty-state headings. Never body &lt;14px in Jakarta. Max 2 Jakarta weights loaded.</w:t>
+      </w:r>
+    </w:p>
+    <w:p>
+      <w:r>
+        <w:rPr>
+          <w:b/>
+        </w:rPr>
+        <w:t xml:space="preserve">Body/UI (legible/functional): </w:t>
+      </w:r>
+      <w:r>
+        <w:t>Inter 400/500/600 — body 16/400, default 14/400, buttons 14–16/600, field labels 14/500, helper/validation 13–14/400–500, nav/tabs. Letter-spacing -0.01em on 14–16px buttons for tap legibility. Line-height 1.5 body, 1.3 headings.</w:t>
+      </w:r>
+    </w:p>
+    <w:p>
+      <w:r>
+        <w:rPr>
+          <w:b/>
+        </w:rPr>
+        <w:t xml:space="preserve">Metadata/Admin (machine facts): </w:t>
+      </w:r>
+      <w:r>
+        <w:t>ui-monospace/SFMono/Menlo/Consolas — IDs, timestamps, audit rows, journey codes (F-codes), 12–13px/400. Signals “system fact, not human word”.</w:t>
+      </w:r>
+    </w:p>
+    <w:p>
+      <w:r>
+        <w:rPr>
+          <w:b/>
+        </w:rPr>
+        <w:t xml:space="preserve">Rules: </w:t>
+      </w:r>
+      <w:r>
+        <w:t>1 primary action per screen in Jakarta 16/600 or Inter 600 — never all-caps; sentence case always (“Introduce Sarah”, not “INTRODUCE SARAH”). Person name always Jakarta 600, never mono. Status pills Inter 12–13/500 + icon, never colour alone. Validation in Inter 13/500 with icon + field link. Load Jakarta 600+700 + Inter 400+500+600 only (poor-data budget). Fallbacks: Jakarta→Manrope→system; Inter→system.</w:t>
+      </w:r>
+    </w:p>
+    <w:p>
+      <w:r>
+        <w:t>ROE — No one lost to silence.</w:t>
+      </w:r>
+    </w:p>
     <w:sectPr>
       <w:pgSz w:w="11906" w:h="16838"/>
       <w:pgMar w:top="1440" w:right="1440" w:bottom="1440" w:left="1440" w:header="708" w:footer="708" w:gutter="0"/>

</xml_diff>